<commit_message>
FAI: apps de cada práctica, péndulos acoplados con el montaje real, Pohl solo amortiguadas
Co-Authored-By: Claude Opus 5.5 <noreply@anthropic.com>
Claude-Session: https://claude.ai/code/session_01GdrGkTkQ1SpY6BWmf3EBwF
</commit_message>
<xml_diff>
--- a/fichas/fai-pendulos-acoplados.docx
+++ b/fichas/fai-pendulos-acoplados.docx
@@ -341,7 +341,50 @@
         <w:jc w:val="both"/>
       </w:pPr>
       <w:r>
-        <w:t xml:space="preserve">Cualquier otro movimiento es una superposición de los dos modos. Si se separa un solo péndulo y se suelta, la energía pasa de uno a otro: la amplitud de cada péndulo se anula periódicamente, con el periodo de batido</w:t>
+        <w:t xml:space="preserve">Cualquier otro movimiento es una superposición de los dos modos. Si se separa un solo péndulo y se suelta, la energía pasa de uno a otro: cada péndulo oscila con un periodo intermedio entre</w:t>
+      </w:r>
+      <w:r>
+        <w:t xml:space="preserve"> </w:t>
+      </w:r>
+      <m:oMath>
+        <m:sSub>
+          <m:e>
+            <m:r>
+              <m:t>T</m:t>
+            </m:r>
+          </m:e>
+          <m:sub>
+            <m:r>
+              <m:t>1</m:t>
+            </m:r>
+          </m:sub>
+        </m:sSub>
+      </m:oMath>
+      <w:r>
+        <w:t xml:space="preserve"> </w:t>
+      </w:r>
+      <w:r>
+        <w:t xml:space="preserve">y</w:t>
+      </w:r>
+      <w:r>
+        <w:t xml:space="preserve"> </w:t>
+      </w:r>
+      <m:oMath>
+        <m:sSub>
+          <m:e>
+            <m:r>
+              <m:t>T</m:t>
+            </m:r>
+          </m:e>
+          <m:sub>
+            <m:r>
+              <m:t>2</m:t>
+            </m:r>
+          </m:sub>
+        </m:sSub>
+      </m:oMath>
+      <w:r>
+        <w:t xml:space="preserve">, y su amplitud se anula periódicamente, con el periodo de batido</w:t>
       </w:r>
     </w:p>
     <w:p>
@@ -509,7 +552,7 @@
         <w:jc w:val="both"/>
       </w:pPr>
       <w:r>
-        <w:t xml:space="preserve">Los dos péndulos cuelgan de dos soportes separados unos 10 cm, con hilos de unos 40 cm. Antes de acoplarlos, ajustar las longitudes hasta que los dos tengan el mismo periodo. Después, atar un hilo de unos 20 cm a los dos péndulos a la misma altura y colgar en su centro la pesa</w:t>
+        <w:t xml:space="preserve">El montaje ya está hecho y no hay que tocar los hilos ni los nudos. Cada péndulo es una pesa de 50 g con su varilla, colgada de un hilo de unos 70 cm, y los dos soportes están separados unos 22 cm. El hilo de acoplamiento está atado a los dos péndulos a la misma altura, y de su centro cuelga un portapesas. Lo único que se cambia durante la práctica son las pesas del portapesas, que forman la masa</w:t>
       </w:r>
       <w:r>
         <w:t xml:space="preserve"> </w:t>
@@ -530,9 +573,112 @@
         <w:jc w:val="both"/>
       </w:pPr>
       <w:r>
-        <w:t xml:space="preserve">Los péndulos se separan siempre en el plano que forman los dos péndulos y el hilo, con amplitudes pequeñas, de unos 2 cm. Si la pesa es demasiado grande, el hilo tira de los péndulos hacia dentro y cuelgan torcidos; por eso se empieza con 10 g y se va reduciendo.</w:t>
+        <w:t xml:space="preserve">La longitud</w:t>
+      </w:r>
+      <w:r>
+        <w:t xml:space="preserve"> </w:t>
+      </w:r>
+      <m:oMath>
+        <m:r>
+          <m:t>L</m:t>
+        </m:r>
+      </m:oMath>
+      <w:r>
+        <w:t xml:space="preserve"> </w:t>
+      </w:r>
+      <w:r>
+        <w:t xml:space="preserve">se mide con la cinta métrica desde el punto de suspensión hasta el centro de la pesa dorada. Los péndulos se separan siempre en el plano que forman los dos péndulos y el hilo, con amplitudes pequeñas, de unos 2 cm. Para soltarlos a la vez y con la misma separación, ayuda sujetarlos con una regla apoyada en las dos pesas y retirarla de golpe.</w:t>
       </w:r>
     </w:p>
+    <w:p>
+      <w:pPr>
+        <w:pStyle w:val="TableCaption"/>
+        <w:keepNext/>
+        <w:spacing w:after="80" w:before="200"/>
+        <w:jc w:val="center"/>
+      </w:pPr>
+      <w:r>
+        <w:t xml:space="preserve">Tabla 1. Longitud de los péndulos.</w:t>
+      </w:r>
+    </w:p>
+    <w:tbl>
+      <w:tblPr>
+        <w:tblW w:type="pct" w:w="5000"/>
+        <w:jc w:val="center"/>
+        <w:tblBorders>
+          <w:top w:val="single" w:sz="6" w:color="000000"/>
+          <w:left w:val="single" w:sz="6" w:color="000000"/>
+          <w:bottom w:val="single" w:sz="6" w:color="000000"/>
+          <w:right w:val="single" w:sz="6" w:color="000000"/>
+          <w:insideH w:val="single" w:sz="6" w:color="000000"/>
+          <w:insideV w:val="single" w:sz="6" w:color="000000"/>
+        </w:tblBorders>
+        <w:tblLook w:firstRow="1" w:lastRow="0" w:firstColumn="0" w:lastColumn="0" w:noHBand="0" w:noVBand="0" w:val="0020"/>
+        <w:tblCaption w:val="Tabla 1. Longitud de los péndulos."/>
+      </w:tblPr>
+      <w:tblGrid>
+        <w:gridCol w:w="7920"/>
+      </w:tblGrid>
+      <w:tr>
+        <w:trPr>
+          <w:trHeight w:val="510" w:hRule="atLeast"/>
+          <w:tblHeader w:val="true"/>
+        </w:trPr>
+        <w:tc>
+          <w:tcPr>
+            <w:shd w:val="clear" w:color="auto" w:fill="FFF0C1"/>
+            <w:vAlign w:val="center"/>
+          </w:tcPr>
+          <w:p>
+            <w:pPr>
+              <w:pStyle w:val="Compact"/>
+              <w:keepNext/>
+              <w:jc w:val="center"/>
+            </w:pPr>
+            <m:oMath>
+              <m:r>
+                <m:t>L</m:t>
+              </m:r>
+            </m:oMath>
+            <w:r>
+              <w:rPr>
+                <w:sz w:val="20"/>
+              </w:rPr>
+              <w:t xml:space="preserve"> </w:t>
+            </w:r>
+            <w:r>
+              <w:rPr>
+                <w:sz w:val="20"/>
+              </w:rPr>
+              <w:t xml:space="preserve">(m)</w:t>
+            </w:r>
+          </w:p>
+        </w:tc>
+      </w:tr>
+      <w:tr>
+        <w:trPr>
+          <w:trHeight w:val="425" w:hRule="atLeast"/>
+        </w:trPr>
+        <w:tc>
+          <w:tcPr>
+            <w:vAlign w:val="center"/>
+          </w:tcPr>
+          <w:p>
+            <w:pPr>
+              <w:pStyle w:val="Compact"/>
+              <w:keepNext/>
+              <w:jc w:val="center"/>
+            </w:pPr>
+            <w:r>
+              <w:rPr>
+                <w:sz w:val="20"/>
+              </w:rPr>
+              <w:t xml:space="preserve"> </w:t>
+            </w:r>
+          </w:p>
+        </w:tc>
+      </w:tr>
+    </w:tbl>
     <w:bookmarkEnd w:id="26"/>
     <w:bookmarkStart w:id="30" w:name="resultados"/>
     <w:p>
@@ -576,7 +722,7 @@
         <w:jc w:val="both"/>
       </w:pPr>
       <w:r>
-        <w:t xml:space="preserve">Con la pesa de 10 g, separar los dos péndulos lo mismo hacia el mismo lado, soltarlos a la vez y medir tres veces el tiempo de 10 oscilaciones. El periodo es</w:t>
+        <w:t xml:space="preserve">Separar los dos péndulos lo mismo hacia el mismo lado, soltarlos a la vez y medir tres veces el tiempo de 10 oscilaciones. El periodo es</w:t>
       </w:r>
       <w:r>
         <w:t xml:space="preserve"> </w:t>
@@ -694,7 +840,7 @@
         <w:jc w:val="center"/>
       </w:pPr>
       <w:r>
-        <w:t xml:space="preserve">Tabla 1. Modo en fase. Escriba</w:t>
+        <w:t xml:space="preserve">Tabla 2. Modo en fase. Escriba</w:t>
       </w:r>
       <w:r>
         <w:t xml:space="preserve"> </w:t>
@@ -781,7 +927,7 @@
           <w:insideV w:val="single" w:sz="6" w:color="000000"/>
         </w:tblBorders>
         <w:tblLook w:firstRow="1" w:lastRow="0" w:firstColumn="0" w:lastColumn="0" w:noHBand="0" w:noVBand="0" w:val="0020"/>
-        <w:tblCaption w:val="Tabla 1. Modo en fase. Escriba T_1, \omega_1 y \omega_1^2 con su error."/>
+        <w:tblCaption w:val="Tabla 2. Modo en fase. Escriba T_1, \omega_1 y \omega_1^2 con su error."/>
       </w:tblPr>
       <w:tblGrid>
         <w:gridCol w:w="1320"/>
@@ -1203,7 +1349,35 @@
         <w:jc w:val="both"/>
       </w:pPr>
       <w:r>
-        <w:t xml:space="preserve">Separar los dos péndulos lo mismo hacia lados opuestos, soltarlos a la vez y medir tres veces el tiempo de 10 oscilaciones. Hacerlo con las pesas de 10, 7 y 4 g.</w:t>
+        <w:t xml:space="preserve">Separar los dos péndulos lo mismo hacia lados opuestos, soltarlos a la vez y medir tres veces el tiempo de 10 oscilaciones. Hacerlo para cuatro masas</w:t>
+      </w:r>
+      <w:r>
+        <w:t xml:space="preserve"> </w:t>
+      </w:r>
+      <m:oMath>
+        <m:r>
+          <m:t>M</m:t>
+        </m:r>
+      </m:oMath>
+      <w:r>
+        <w:t xml:space="preserve"> </w:t>
+      </w:r>
+      <w:r>
+        <w:t xml:space="preserve">del portapesas con sus pesas, entre 30 g y 60 g. La masa</w:t>
+      </w:r>
+      <w:r>
+        <w:t xml:space="preserve"> </w:t>
+      </w:r>
+      <m:oMath>
+        <m:r>
+          <m:t>M</m:t>
+        </m:r>
+      </m:oMath>
+      <w:r>
+        <w:t xml:space="preserve"> </w:t>
+      </w:r>
+      <w:r>
+        <w:t xml:space="preserve">es la del portapesas más la de las pesas que lleve.</w:t>
       </w:r>
     </w:p>
     <w:p>
@@ -1214,7 +1388,7 @@
         <w:jc w:val="center"/>
       </w:pPr>
       <w:r>
-        <w:t xml:space="preserve">Tabla 2. Modo en oposición. Escriba</w:t>
+        <w:t xml:space="preserve">Tabla 3. Modo en oposición. Escriba</w:t>
       </w:r>
       <w:r>
         <w:t xml:space="preserve"> </w:t>
@@ -1301,7 +1475,7 @@
           <w:insideV w:val="single" w:sz="6" w:color="000000"/>
         </w:tblBorders>
         <w:tblLook w:firstRow="1" w:lastRow="0" w:firstColumn="0" w:lastColumn="0" w:noHBand="0" w:noVBand="0" w:val="0020"/>
-        <w:tblCaption w:val="Tabla 2. Modo en oposición. Escriba T_2, \omega_2 y \omega_2^2 con su error."/>
+        <w:tblCaption w:val="Tabla 3. Modo en oposición. Escriba T_2, \omega_2 y \omega_2^2 con su error."/>
       </w:tblPr>
       <w:tblGrid>
         <w:gridCol w:w="1131"/>
@@ -1632,7 +1806,7 @@
               <w:rPr>
                 <w:sz w:val="20"/>
               </w:rPr>
-              <w:t xml:space="preserve">10</w:t>
+              <w:t xml:space="preserve"> </w:t>
             </w:r>
           </w:p>
         </w:tc>
@@ -1763,7 +1937,7 @@
               <w:rPr>
                 <w:sz w:val="20"/>
               </w:rPr>
-              <w:t xml:space="preserve">7</w:t>
+              <w:t xml:space="preserve"> </w:t>
             </w:r>
           </w:p>
         </w:tc>
@@ -1894,7 +2068,138 @@
               <w:rPr>
                 <w:sz w:val="20"/>
               </w:rPr>
-              <w:t xml:space="preserve">4</w:t>
+              <w:t xml:space="preserve"> </w:t>
+            </w:r>
+          </w:p>
+        </w:tc>
+        <w:tc>
+          <w:tcPr>
+            <w:vAlign w:val="center"/>
+          </w:tcPr>
+          <w:p>
+            <w:pPr>
+              <w:pStyle w:val="Compact"/>
+              <w:keepNext/>
+              <w:jc w:val="center"/>
+            </w:pPr>
+            <w:r>
+              <w:rPr>
+                <w:sz w:val="20"/>
+              </w:rPr>
+              <w:t xml:space="preserve"> </w:t>
+            </w:r>
+          </w:p>
+        </w:tc>
+        <w:tc>
+          <w:tcPr>
+            <w:vAlign w:val="center"/>
+          </w:tcPr>
+          <w:p>
+            <w:pPr>
+              <w:pStyle w:val="Compact"/>
+              <w:keepNext/>
+              <w:jc w:val="center"/>
+            </w:pPr>
+            <w:r>
+              <w:rPr>
+                <w:sz w:val="20"/>
+              </w:rPr>
+              <w:t xml:space="preserve"> </w:t>
+            </w:r>
+          </w:p>
+        </w:tc>
+        <w:tc>
+          <w:tcPr>
+            <w:vAlign w:val="center"/>
+          </w:tcPr>
+          <w:p>
+            <w:pPr>
+              <w:pStyle w:val="Compact"/>
+              <w:keepNext/>
+              <w:jc w:val="center"/>
+            </w:pPr>
+            <w:r>
+              <w:rPr>
+                <w:sz w:val="20"/>
+              </w:rPr>
+              <w:t xml:space="preserve"> </w:t>
+            </w:r>
+          </w:p>
+        </w:tc>
+        <w:tc>
+          <w:tcPr>
+            <w:vAlign w:val="center"/>
+          </w:tcPr>
+          <w:p>
+            <w:pPr>
+              <w:pStyle w:val="Compact"/>
+              <w:keepNext/>
+              <w:jc w:val="center"/>
+            </w:pPr>
+            <w:r>
+              <w:rPr>
+                <w:sz w:val="20"/>
+              </w:rPr>
+              <w:t xml:space="preserve"> </w:t>
+            </w:r>
+          </w:p>
+        </w:tc>
+        <w:tc>
+          <w:tcPr>
+            <w:vAlign w:val="center"/>
+          </w:tcPr>
+          <w:p>
+            <w:pPr>
+              <w:pStyle w:val="Compact"/>
+              <w:keepNext/>
+              <w:jc w:val="center"/>
+            </w:pPr>
+            <w:r>
+              <w:rPr>
+                <w:sz w:val="20"/>
+              </w:rPr>
+              <w:t xml:space="preserve"> </w:t>
+            </w:r>
+          </w:p>
+        </w:tc>
+        <w:tc>
+          <w:tcPr>
+            <w:vAlign w:val="center"/>
+          </w:tcPr>
+          <w:p>
+            <w:pPr>
+              <w:pStyle w:val="Compact"/>
+              <w:keepNext/>
+              <w:jc w:val="center"/>
+            </w:pPr>
+            <w:r>
+              <w:rPr>
+                <w:sz w:val="20"/>
+              </w:rPr>
+              <w:t xml:space="preserve"> </w:t>
+            </w:r>
+          </w:p>
+        </w:tc>
+      </w:tr>
+      <w:tr>
+        <w:trPr>
+          <w:trHeight w:val="425" w:hRule="atLeast"/>
+        </w:trPr>
+        <w:tc>
+          <w:tcPr>
+            <w:vAlign w:val="center"/>
+          </w:tcPr>
+          <w:p>
+            <w:pPr>
+              <w:pStyle w:val="Compact"/>
+              <w:keepNext/>
+              <w:jc w:val="center"/>
+            </w:pPr>
+            <w:r>
+              <w:rPr>
+                <w:sz w:val="20"/>
+              </w:rPr>
+              <w:t xml:space="preserve"> </w:t>
             </w:r>
           </w:p>
         </w:tc>
@@ -2034,7 +2339,21 @@
         <w:jc w:val="both"/>
       </w:pPr>
       <w:r>
-        <w:t xml:space="preserve">Con la pesa de 10 g, separar solo el péndulo 1, sujetando el 2 en su posición de reposo, y soltarlos a la vez. El péndulo 1 se irá parando mientras el 2 empieza a oscilar, y después al revés. Medir tres veces el tiempo entre dos paradas consecutivas del péndulo 1, que es el periodo de batido</w:t>
+        <w:t xml:space="preserve">Con</w:t>
+      </w:r>
+      <w:r>
+        <w:t xml:space="preserve"> </w:t>
+      </w:r>
+      <m:oMath>
+        <m:r>
+          <m:t>M</m:t>
+        </m:r>
+      </m:oMath>
+      <w:r>
+        <w:t xml:space="preserve"> </w:t>
+      </w:r>
+      <w:r>
+        <w:t xml:space="preserve">= 60 g, sujetar el péndulo 2 en reposo, separar solo el péndulo 1 y soltarlos a la vez. El péndulo 1 se irá parando mientras el 2 empieza a oscilar, y después al revés. Poner en marcha el cronómetro en un momento en que el péndulo 1 esté parado y detenerlo la siguiente vez que se pare: ese tiempo es el periodo de batido</w:t>
       </w:r>
       <w:r>
         <w:t xml:space="preserve"> </w:t>
@@ -2054,7 +2373,18 @@
         </m:sSub>
       </m:oMath>
       <w:r>
-        <w:t xml:space="preserve">.</w:t>
+        <w:t xml:space="preserve">. Mientras tanto, contar las oscilaciones completas que da el péndulo 1,</w:t>
+      </w:r>
+      <w:r>
+        <w:t xml:space="preserve"> </w:t>
+      </w:r>
+      <m:oMath>
+        <m:r>
+          <m:t>N</m:t>
+        </m:r>
+      </m:oMath>
+      <w:r>
+        <w:t xml:space="preserve">. Repetirlo tres veces. Si cuesta ver el momento en que se para, grabar el movimiento con el móvil y medir después en el vídeo.</w:t>
       </w:r>
     </w:p>
     <w:p>
@@ -2065,7 +2395,7 @@
         <w:jc w:val="center"/>
       </w:pPr>
       <w:r>
-        <w:t xml:space="preserve">Tabla 3. Periodo de batido con</w:t>
+        <w:t xml:space="preserve">Tabla 4. Batidos con</w:t>
       </w:r>
       <w:r>
         <w:t xml:space="preserve"> </w:t>
@@ -2079,7 +2409,7 @@
         <w:t xml:space="preserve"> </w:t>
       </w:r>
       <w:r>
-        <w:t xml:space="preserve">= 10 g.</w:t>
+        <w:t xml:space="preserve">= 60 g.</w:t>
       </w:r>
     </w:p>
     <w:tbl>
@@ -2095,13 +2425,14 @@
           <w:insideV w:val="single" w:sz="6" w:color="000000"/>
         </w:tblBorders>
         <w:tblLook w:firstRow="1" w:lastRow="0" w:firstColumn="0" w:lastColumn="0" w:noHBand="0" w:noVBand="0" w:val="0020"/>
-        <w:tblCaption w:val="Tabla 3. Periodo de batido con M = 10 g."/>
+        <w:tblCaption w:val="Tabla 4. Batidos con M = 60 g."/>
       </w:tblPr>
       <w:tblGrid>
-        <w:gridCol w:w="1980"/>
-        <w:gridCol w:w="1980"/>
-        <w:gridCol w:w="1980"/>
-        <w:gridCol w:w="1980"/>
+        <w:gridCol w:w="1584"/>
+        <w:gridCol w:w="1584"/>
+        <w:gridCol w:w="1584"/>
+        <w:gridCol w:w="1584"/>
+        <w:gridCol w:w="1584"/>
       </w:tblGrid>
       <w:tr>
         <w:trPr>
@@ -2119,41 +2450,6 @@
               <w:keepNext/>
               <w:jc w:val="center"/>
             </w:pPr>
-            <m:oMath>
-              <m:sSub>
-                <m:e>
-                  <m:r>
-                    <m:t>T</m:t>
-                  </m:r>
-                </m:e>
-                <m:sub>
-                  <m:r>
-                    <m:t>b</m:t>
-                  </m:r>
-                  <m:r>
-                    <m:rPr>
-                      <m:sty m:val="p"/>
-                    </m:rPr>
-                    <m:t>,</m:t>
-                  </m:r>
-                  <m:r>
-                    <m:t>1</m:t>
-                  </m:r>
-                </m:sub>
-              </m:sSub>
-            </m:oMath>
-            <w:r>
-              <w:rPr>
-                <w:sz w:val="20"/>
-              </w:rPr>
-              <w:t xml:space="preserve"> </w:t>
-            </w:r>
-            <w:r>
-              <w:rPr>
-                <w:sz w:val="20"/>
-              </w:rPr>
-              <w:t xml:space="preserve">(s)</w:t>
-            </w:r>
           </w:p>
         </w:tc>
         <w:tc>
@@ -2167,40 +2463,11 @@
               <w:keepNext/>
               <w:jc w:val="center"/>
             </w:pPr>
-            <m:oMath>
-              <m:sSub>
-                <m:e>
-                  <m:r>
-                    <m:t>T</m:t>
-                  </m:r>
-                </m:e>
-                <m:sub>
-                  <m:r>
-                    <m:t>b</m:t>
-                  </m:r>
-                  <m:r>
-                    <m:rPr>
-                      <m:sty m:val="p"/>
-                    </m:rPr>
-                    <m:t>,</m:t>
-                  </m:r>
-                  <m:r>
-                    <m:t>2</m:t>
-                  </m:r>
-                </m:sub>
-              </m:sSub>
-            </m:oMath>
-            <w:r>
-              <w:rPr>
-                <w:sz w:val="20"/>
-              </w:rPr>
-              <w:t xml:space="preserve"> </w:t>
-            </w:r>
-            <w:r>
-              <w:rPr>
-                <w:sz w:val="20"/>
-              </w:rPr>
-              <w:t xml:space="preserve">(s)</w:t>
+            <w:r>
+              <w:rPr>
+                <w:sz w:val="20"/>
+              </w:rPr>
+              <w:t xml:space="preserve">Medida 1</w:t>
             </w:r>
           </w:p>
         </w:tc>
@@ -2215,40 +2482,11 @@
               <w:keepNext/>
               <w:jc w:val="center"/>
             </w:pPr>
-            <m:oMath>
-              <m:sSub>
-                <m:e>
-                  <m:r>
-                    <m:t>T</m:t>
-                  </m:r>
-                </m:e>
-                <m:sub>
-                  <m:r>
-                    <m:t>b</m:t>
-                  </m:r>
-                  <m:r>
-                    <m:rPr>
-                      <m:sty m:val="p"/>
-                    </m:rPr>
-                    <m:t>,</m:t>
-                  </m:r>
-                  <m:r>
-                    <m:t>3</m:t>
-                  </m:r>
-                </m:sub>
-              </m:sSub>
-            </m:oMath>
-            <w:r>
-              <w:rPr>
-                <w:sz w:val="20"/>
-              </w:rPr>
-              <w:t xml:space="preserve"> </w:t>
-            </w:r>
-            <w:r>
-              <w:rPr>
-                <w:sz w:val="20"/>
-              </w:rPr>
-              <w:t xml:space="preserve">(s)</w:t>
+            <w:r>
+              <w:rPr>
+                <w:sz w:val="20"/>
+              </w:rPr>
+              <w:t xml:space="preserve">Medida 2</w:t>
             </w:r>
           </w:p>
         </w:tc>
@@ -2263,31 +2501,30 @@
               <w:keepNext/>
               <w:jc w:val="center"/>
             </w:pPr>
-            <m:oMath>
-              <m:sSub>
-                <m:e>
-                  <m:r>
-                    <m:t>T</m:t>
-                  </m:r>
-                </m:e>
-                <m:sub>
-                  <m:r>
-                    <m:t>b</m:t>
-                  </m:r>
-                </m:sub>
-              </m:sSub>
-            </m:oMath>
-            <w:r>
-              <w:rPr>
-                <w:sz w:val="20"/>
-              </w:rPr>
-              <w:t xml:space="preserve"> </w:t>
-            </w:r>
-            <w:r>
-              <w:rPr>
-                <w:sz w:val="20"/>
-              </w:rPr>
-              <w:t xml:space="preserve">medido (s)</w:t>
+            <w:r>
+              <w:rPr>
+                <w:sz w:val="20"/>
+              </w:rPr>
+              <w:t xml:space="preserve">Medida 3</w:t>
+            </w:r>
+          </w:p>
+        </w:tc>
+        <w:tc>
+          <w:tcPr>
+            <w:shd w:val="clear" w:color="auto" w:fill="FFF0C1"/>
+            <w:vAlign w:val="center"/>
+          </w:tcPr>
+          <w:p>
+            <w:pPr>
+              <w:pStyle w:val="Compact"/>
+              <w:keepNext/>
+              <w:jc w:val="center"/>
+            </w:pPr>
+            <w:r>
+              <w:rPr>
+                <w:sz w:val="20"/>
+              </w:rPr>
+              <w:t xml:space="preserve">Media</w:t>
             </w:r>
           </w:p>
         </w:tc>
@@ -2296,6 +2533,138 @@
         <w:trPr>
           <w:trHeight w:val="425" w:hRule="atLeast"/>
         </w:trPr>
+        <w:tc>
+          <w:tcPr>
+            <w:vAlign w:val="center"/>
+          </w:tcPr>
+          <w:p>
+            <w:pPr>
+              <w:pStyle w:val="Compact"/>
+              <w:keepNext/>
+              <w:jc w:val="center"/>
+            </w:pPr>
+            <m:oMath>
+              <m:sSub>
+                <m:e>
+                  <m:r>
+                    <m:t>T</m:t>
+                  </m:r>
+                </m:e>
+                <m:sub>
+                  <m:r>
+                    <m:t>b</m:t>
+                  </m:r>
+                </m:sub>
+              </m:sSub>
+            </m:oMath>
+            <w:r>
+              <w:rPr>
+                <w:sz w:val="20"/>
+              </w:rPr>
+              <w:t xml:space="preserve"> </w:t>
+            </w:r>
+            <w:r>
+              <w:rPr>
+                <w:sz w:val="20"/>
+              </w:rPr>
+              <w:t xml:space="preserve">(s)</w:t>
+            </w:r>
+          </w:p>
+        </w:tc>
+        <w:tc>
+          <w:tcPr>
+            <w:vAlign w:val="center"/>
+          </w:tcPr>
+          <w:p>
+            <w:pPr>
+              <w:pStyle w:val="Compact"/>
+              <w:keepNext/>
+              <w:jc w:val="center"/>
+            </w:pPr>
+            <w:r>
+              <w:rPr>
+                <w:sz w:val="20"/>
+              </w:rPr>
+              <w:t xml:space="preserve"> </w:t>
+            </w:r>
+          </w:p>
+        </w:tc>
+        <w:tc>
+          <w:tcPr>
+            <w:vAlign w:val="center"/>
+          </w:tcPr>
+          <w:p>
+            <w:pPr>
+              <w:pStyle w:val="Compact"/>
+              <w:keepNext/>
+              <w:jc w:val="center"/>
+            </w:pPr>
+            <w:r>
+              <w:rPr>
+                <w:sz w:val="20"/>
+              </w:rPr>
+              <w:t xml:space="preserve"> </w:t>
+            </w:r>
+          </w:p>
+        </w:tc>
+        <w:tc>
+          <w:tcPr>
+            <w:vAlign w:val="center"/>
+          </w:tcPr>
+          <w:p>
+            <w:pPr>
+              <w:pStyle w:val="Compact"/>
+              <w:keepNext/>
+              <w:jc w:val="center"/>
+            </w:pPr>
+            <w:r>
+              <w:rPr>
+                <w:sz w:val="20"/>
+              </w:rPr>
+              <w:t xml:space="preserve"> </w:t>
+            </w:r>
+          </w:p>
+        </w:tc>
+        <w:tc>
+          <w:tcPr>
+            <w:vAlign w:val="center"/>
+          </w:tcPr>
+          <w:p>
+            <w:pPr>
+              <w:pStyle w:val="Compact"/>
+              <w:keepNext/>
+              <w:jc w:val="center"/>
+            </w:pPr>
+            <w:r>
+              <w:rPr>
+                <w:sz w:val="20"/>
+              </w:rPr>
+              <w:t xml:space="preserve"> </w:t>
+            </w:r>
+          </w:p>
+        </w:tc>
+      </w:tr>
+      <w:tr>
+        <w:trPr>
+          <w:trHeight w:val="425" w:hRule="atLeast"/>
+        </w:trPr>
+        <w:tc>
+          <w:tcPr>
+            <w:vAlign w:val="center"/>
+          </w:tcPr>
+          <w:p>
+            <w:pPr>
+              <w:pStyle w:val="Compact"/>
+              <w:keepNext/>
+              <w:jc w:val="center"/>
+            </w:pPr>
+            <m:oMath>
+              <m:r>
+                <m:t>N</m:t>
+              </m:r>
+            </m:oMath>
+          </w:p>
+        </w:tc>
         <w:tc>
           <w:tcPr>
             <w:vAlign w:val="center"/>
@@ -2590,7 +2959,7 @@
         <w:jc w:val="center"/>
       </w:pPr>
       <w:r>
-        <w:t xml:space="preserve">Tabla 4. Ajuste lineal y frecuencia del modo en fase.</w:t>
+        <w:t xml:space="preserve">Tabla 5. Ajuste lineal y frecuencia del modo en fase.</w:t>
       </w:r>
     </w:p>
     <w:tbl>
@@ -2606,7 +2975,7 @@
           <w:insideV w:val="single" w:sz="6" w:color="000000"/>
         </w:tblBorders>
         <w:tblLook w:firstRow="1" w:lastRow="0" w:firstColumn="0" w:lastColumn="0" w:noHBand="0" w:noVBand="0" w:val="0020"/>
-        <w:tblCaption w:val="Tabla 4. Ajuste lineal y frecuencia del modo en fase."/>
+        <w:tblCaption w:val="Tabla 5. Ajuste lineal y frecuencia del modo en fase."/>
       </w:tblPr>
       <w:tblGrid>
         <w:gridCol w:w="1320"/>
@@ -2942,7 +3311,7 @@
         <w:t xml:space="preserve"> </w:t>
       </w:r>
       <w:r>
-        <w:t xml:space="preserve">= 10 g con</w:t>
+        <w:t xml:space="preserve">= 60 g con</w:t>
       </w:r>
       <w:r>
         <w:t xml:space="preserve"> </w:t>
@@ -2965,7 +3334,7 @@
         <w:t xml:space="preserve"> </w:t>
       </w:r>
       <w:r>
-        <w:t xml:space="preserve">(Parte A) y</w:t>
+        <w:t xml:space="preserve">(Tabla 2) y</w:t>
       </w:r>
       <w:r>
         <w:t xml:space="preserve"> </w:t>
@@ -2988,7 +3357,79 @@
         <w:t xml:space="preserve"> </w:t>
       </w:r>
       <w:r>
-        <w:t xml:space="preserve">(Tabla 2), y el cociente entre el medido y el teórico.</w:t>
+        <w:t xml:space="preserve">(Tabla 3), y el cociente entre el medido y el teórico. Calcule también el periodo de las oscilaciones dentro del batido,</w:t>
+      </w:r>
+      <w:r>
+        <w:t xml:space="preserve"> </w:t>
+      </w:r>
+      <m:oMath>
+        <m:sSub>
+          <m:e>
+            <m:r>
+              <m:t>T</m:t>
+            </m:r>
+          </m:e>
+          <m:sub>
+            <m:r>
+              <m:t>b</m:t>
+            </m:r>
+          </m:sub>
+        </m:sSub>
+        <m:r>
+          <m:rPr>
+            <m:sty m:val="p"/>
+          </m:rPr>
+          <m:t>/</m:t>
+        </m:r>
+        <m:r>
+          <m:t>N</m:t>
+        </m:r>
+      </m:oMath>
+      <w:r>
+        <w:t xml:space="preserve">, y escriba si queda entre</w:t>
+      </w:r>
+      <w:r>
+        <w:t xml:space="preserve"> </w:t>
+      </w:r>
+      <m:oMath>
+        <m:sSub>
+          <m:e>
+            <m:r>
+              <m:t>T</m:t>
+            </m:r>
+          </m:e>
+          <m:sub>
+            <m:r>
+              <m:t>2</m:t>
+            </m:r>
+          </m:sub>
+        </m:sSub>
+      </m:oMath>
+      <w:r>
+        <w:t xml:space="preserve"> </w:t>
+      </w:r>
+      <w:r>
+        <w:t xml:space="preserve">y</w:t>
+      </w:r>
+      <w:r>
+        <w:t xml:space="preserve"> </w:t>
+      </w:r>
+      <m:oMath>
+        <m:sSub>
+          <m:e>
+            <m:r>
+              <m:t>T</m:t>
+            </m:r>
+          </m:e>
+          <m:sub>
+            <m:r>
+              <m:t>1</m:t>
+            </m:r>
+          </m:sub>
+        </m:sSub>
+      </m:oMath>
+      <w:r>
+        <w:t xml:space="preserve">.</w:t>
       </w:r>
     </w:p>
     <w:p>
@@ -2999,7 +3440,7 @@
         <w:jc w:val="center"/>
       </w:pPr>
       <w:r>
-        <w:t xml:space="preserve">Tabla 5. Periodo de batido medido y teórico.</w:t>
+        <w:t xml:space="preserve">Tabla 6. Periodo de batido medido y teórico.</w:t>
       </w:r>
     </w:p>
     <w:tbl>
@@ -3015,12 +3456,14 @@
           <w:insideV w:val="single" w:sz="6" w:color="000000"/>
         </w:tblBorders>
         <w:tblLook w:firstRow="1" w:lastRow="0" w:firstColumn="0" w:lastColumn="0" w:noHBand="0" w:noVBand="0" w:val="0020"/>
-        <w:tblCaption w:val="Tabla 5. Periodo de batido medido y teórico."/>
+        <w:tblCaption w:val="Tabla 6. Periodo de batido medido y teórico."/>
       </w:tblPr>
       <w:tblGrid>
-        <w:gridCol w:w="2640"/>
-        <w:gridCol w:w="2640"/>
-        <w:gridCol w:w="2640"/>
+        <w:gridCol w:w="1584"/>
+        <w:gridCol w:w="1584"/>
+        <w:gridCol w:w="1584"/>
+        <w:gridCol w:w="1584"/>
+        <w:gridCol w:w="1584"/>
       </w:tblGrid>
       <w:tr>
         <w:trPr>
@@ -3124,11 +3567,172 @@
             </w:r>
           </w:p>
         </w:tc>
+        <w:tc>
+          <w:tcPr>
+            <w:shd w:val="clear" w:color="auto" w:fill="FFF0C1"/>
+            <w:vAlign w:val="center"/>
+          </w:tcPr>
+          <w:p>
+            <w:pPr>
+              <w:pStyle w:val="Compact"/>
+              <w:keepNext/>
+              <w:jc w:val="center"/>
+            </w:pPr>
+            <m:oMath>
+              <m:sSub>
+                <m:e>
+                  <m:r>
+                    <m:t>T</m:t>
+                  </m:r>
+                </m:e>
+                <m:sub>
+                  <m:r>
+                    <m:t>b</m:t>
+                  </m:r>
+                </m:sub>
+              </m:sSub>
+              <m:r>
+                <m:rPr>
+                  <m:sty m:val="p"/>
+                </m:rPr>
+                <m:t>/</m:t>
+              </m:r>
+              <m:r>
+                <m:t>N</m:t>
+              </m:r>
+            </m:oMath>
+            <w:r>
+              <w:rPr>
+                <w:sz w:val="20"/>
+              </w:rPr>
+              <w:t xml:space="preserve"> </w:t>
+            </w:r>
+            <w:r>
+              <w:rPr>
+                <w:sz w:val="20"/>
+              </w:rPr>
+              <w:t xml:space="preserve">(s)</w:t>
+            </w:r>
+          </w:p>
+        </w:tc>
+        <w:tc>
+          <w:tcPr>
+            <w:shd w:val="clear" w:color="auto" w:fill="FFF0C1"/>
+            <w:vAlign w:val="center"/>
+          </w:tcPr>
+          <w:p>
+            <w:pPr>
+              <w:pStyle w:val="Compact"/>
+              <w:keepNext/>
+              <w:jc w:val="center"/>
+            </w:pPr>
+            <w:r>
+              <w:rPr>
+                <w:sz w:val="20"/>
+              </w:rPr>
+              <w:t xml:space="preserve">¿Entre</w:t>
+            </w:r>
+            <w:r>
+              <w:rPr>
+                <w:sz w:val="20"/>
+              </w:rPr>
+              <w:t xml:space="preserve"> </w:t>
+            </w:r>
+            <m:oMath>
+              <m:sSub>
+                <m:e>
+                  <m:r>
+                    <m:t>T</m:t>
+                  </m:r>
+                </m:e>
+                <m:sub>
+                  <m:r>
+                    <m:t>2</m:t>
+                  </m:r>
+                </m:sub>
+              </m:sSub>
+            </m:oMath>
+            <w:r>
+              <w:rPr>
+                <w:sz w:val="20"/>
+              </w:rPr>
+              <w:t xml:space="preserve"> </w:t>
+            </w:r>
+            <w:r>
+              <w:rPr>
+                <w:sz w:val="20"/>
+              </w:rPr>
+              <w:t xml:space="preserve">y</w:t>
+            </w:r>
+            <w:r>
+              <w:rPr>
+                <w:sz w:val="20"/>
+              </w:rPr>
+              <w:t xml:space="preserve"> </w:t>
+            </w:r>
+            <m:oMath>
+              <m:sSub>
+                <m:e>
+                  <m:r>
+                    <m:t>T</m:t>
+                  </m:r>
+                </m:e>
+                <m:sub>
+                  <m:r>
+                    <m:t>1</m:t>
+                  </m:r>
+                </m:sub>
+              </m:sSub>
+            </m:oMath>
+            <w:r>
+              <w:rPr>
+                <w:sz w:val="20"/>
+              </w:rPr>
+              <w:t xml:space="preserve">?</w:t>
+            </w:r>
+          </w:p>
+        </w:tc>
       </w:tr>
       <w:tr>
         <w:trPr>
           <w:trHeight w:val="425" w:hRule="atLeast"/>
         </w:trPr>
+        <w:tc>
+          <w:tcPr>
+            <w:vAlign w:val="center"/>
+          </w:tcPr>
+          <w:p>
+            <w:pPr>
+              <w:pStyle w:val="Compact"/>
+              <w:keepNext/>
+              <w:jc w:val="center"/>
+            </w:pPr>
+            <w:r>
+              <w:rPr>
+                <w:sz w:val="20"/>
+              </w:rPr>
+              <w:t xml:space="preserve"> </w:t>
+            </w:r>
+          </w:p>
+        </w:tc>
+        <w:tc>
+          <w:tcPr>
+            <w:vAlign w:val="center"/>
+          </w:tcPr>
+          <w:p>
+            <w:pPr>
+              <w:pStyle w:val="Compact"/>
+              <w:keepNext/>
+              <w:jc w:val="center"/>
+            </w:pPr>
+            <w:r>
+              <w:rPr>
+                <w:sz w:val="20"/>
+              </w:rPr>
+              <w:t xml:space="preserve"> </w:t>
+            </w:r>
+          </w:p>
+        </w:tc>
         <w:tc>
           <w:tcPr>
             <w:vAlign w:val="center"/>

</xml_diff>